<commit_message>
feat: implementar flujo guiado paso a paso y exportación a PDF en memoria
</commit_message>
<xml_diff>
--- a/Resumen_Legal.docx
+++ b/Resumen_Legal.docx
@@ -4,25 +4,7 @@
   <w:body>
     <w:p>
       <w:r>
-        <w:t>**Resumen del Contrato de Prestación de Servicios Legales entre Despacho Jurídico Ejemplar S.A. y el Cliente Lucifer Estrella de la Mañana**</w:t>
-        <w:br/>
-        <w:br/>
-        <w:t>- **Partes:** El contrato involucra al despacho jurídico "Despacho Jurídico Ejemplar S.A." con domicilio en Calle Principal 123, Ciudad Ejemplo y representado por el Lic. Juan Pérez (el DESPACHO), contra Lucifer Estrella de la Mañana que tiene su domicilio en Lomas María (el CLIENTE).</w:t>
-        <w:br/>
-        <w:br/>
-        <w:t>- **Objeto:** El despacho jurídico se compromete a brindar asesoría y representación legal al cliente para un asunto específico, siguiendo las instrucciones del mismo y respetando normas éticas.</w:t>
-        <w:br/>
-        <w:br/>
-        <w:t>- **Obligaciones del Despacho Jurídico:** Se prometen servicios profesionales oportunos, defensa ante autoridades pertinentes y confidencialidad sobre la información recibida por el despacho jurídico.</w:t>
-        <w:br/>
-        <w:br/>
-        <w:t>- **Honorarios:** El cliente pagará al despacho una suma de $[MONTO], con un 50% como pago inicial y otro 50% en conclusión del asunto legal.</w:t>
-        <w:br/>
-        <w:br/>
-        <w:t>- **Duración del Contrato:** Tiene una duración estimada de [TIEMPO] meses, sujeto a prórroga por acuerdo mutuo entre las partes.</w:t>
-        <w:br/>
-        <w:br/>
-        <w:t>- **Confidencialidad y Terminación:** Se establece un compromiso con la confidencialidad en todas las relaciones contractuales; además, cualquiera de las dos partes puede terminar el contrato si se presenta una causa justificada mediante notificación escrita.</w:t>
+        <w:t>El demandante Kiyotaka Ayanokoji presenta una demanda civil contra la organización "Sala Blanca" por daños y perjuicios derivados del incumplimiento de su obligación de cuidado, violaciones a los derechos humanos e inhumano trato. El programa experimental llevado a cabo en las instalaciones ha causado graves consecuencias psicológicas al demandante, incluyendo un TSPT severo y dificultades emocionales significativas. La petición incluye la orden de cierre definitivo de "Sala Blanca", indemnización por daños morales e materiales en una cantidad total de 50 millones de yenes japoneses, investigación penal contra los responsables del programa y prohibición para que la organización o sus miembros realicen actividades similares.</w:t>
       </w:r>
     </w:p>
     <w:sectPr>

</xml_diff>